<commit_message>
Fiber-loss: robust time_window, GFA cache lock, select_exposures examples
</commit_message>
<xml_diff>
--- a/docs/FIBER_LOSS_METRICS.docx
+++ b/docs/FIBER_LOSS_METRICS.docx
@@ -2,7 +2,7 @@
 <file path=word/document.xml><?xml version="1.0" encoding="utf-8"?>
 <w:document xmlns:w="http://schemas.openxmlformats.org/wordprocessingml/2006/main" xmlns:m="http://schemas.openxmlformats.org/officeDocument/2006/math" xmlns:r="http://schemas.openxmlformats.org/officeDocument/2006/relationships" xmlns:o="urn:schemas-microsoft-com:office:office" xmlns:v="urn:schemas-microsoft-com:vml" xmlns:w10="urn:schemas-microsoft-com:office:word" xmlns:a="http://schemas.openxmlformats.org/drawingml/2006/main" xmlns:pic="http://schemas.openxmlformats.org/drawingml/2006/picture" xmlns:wp="http://schemas.openxmlformats.org/drawingml/2006/wordprocessingDrawing">
   <w:body>
-    <w:bookmarkStart w:id="22" w:name="X174d2939f7bec0a0519e972e46b2d23d5920842"/>
+    <w:bookmarkStart w:id="23" w:name="X174d2939f7bec0a0519e972e46b2d23d5920842"/>
     <w:p>
       <w:pPr>
         <w:pStyle w:val="Heading1"/>
@@ -16,7 +16,7 @@
         <w:pStyle w:val="FirstParagraph"/>
       </w:pPr>
       <w:r>
-        <w:t xml:space="preserve">K. Honscheid (OSU) with Claude (Anthropic) · 2026-08-06 (Exposure API added 2026-08-07)</w:t>
+        <w:t xml:space="preserve">K. Honscheid (OSU) with Claude (Anthropic) · 2026-08-06 (Exposure API added 2026-08-07; worked examples added 2026-08-10)</w:t>
       </w:r>
     </w:p>
     <w:p>
@@ -195,7 +195,7 @@
         <w:t xml:space="preserve">inheriting the artifact.</w:t>
       </w:r>
     </w:p>
-    <w:bookmarkStart w:id="9" w:name="X7dbb68fcf83f0443fe4cee9b4cc774a0ab5e671"/>
+    <w:bookmarkStart w:id="9" w:name="Xf9a904574b914898358079b4158d4b400b787fa"/>
     <w:p>
       <w:pPr>
         <w:pStyle w:val="Heading2"/>
@@ -1272,7 +1272,7 @@
       </w:r>
     </w:p>
     <w:bookmarkEnd w:id="9"/>
-    <w:bookmarkStart w:id="10" w:name="Xbfbda02a0b2a934f7a5eed3c9f84e6e42c83e34"/>
+    <w:bookmarkStart w:id="10" w:name="X17dd7d3ab753f8f72e468ae86703dbd4c721147"/>
     <w:p>
       <w:pPr>
         <w:pStyle w:val="Heading2"/>
@@ -1399,7 +1399,7 @@
       </w:r>
     </w:p>
     <w:bookmarkEnd w:id="10"/>
-    <w:bookmarkStart w:id="11" w:name="the-three-clean-probes-and-their-scope"/>
+    <w:bookmarkStart w:id="11" w:name="Xf037de5b2cbb3fc6aaad91444adc8346703c24a"/>
     <w:p>
       <w:pPr>
         <w:pStyle w:val="Heading2"/>
@@ -2131,7 +2131,7 @@
       </w:r>
     </w:p>
     <w:bookmarkEnd w:id="11"/>
-    <w:bookmarkStart w:id="17" w:name="X70dec59c179625d6e7733ab9c4c7da4e43c2abd"/>
+    <w:bookmarkStart w:id="17" w:name="X363f5e59a83a3837833695d0a4e5ca965419bef"/>
     <w:p>
       <w:pPr>
         <w:pStyle w:val="Heading2"/>
@@ -2272,7 +2272,7 @@
         <w:t xml:space="preserve">two pieces with different inputs and scopes.</w:t>
       </w:r>
     </w:p>
-    <w:bookmarkStart w:id="12" w:name="X78943a7a133d3024f698dff1f88115c6e409ad3"/>
+    <w:bookmarkStart w:id="12" w:name="Xf43d605aa8f94c5210fc3912d2ad3684da3aca2"/>
     <w:p>
       <w:pPr>
         <w:pStyle w:val="Heading3"/>
@@ -3091,7 +3091,7 @@
       </w:r>
     </w:p>
     <w:bookmarkEnd w:id="12"/>
-    <w:bookmarkStart w:id="13" w:name="X85f01169bb459252e9c4500ce2f9fd4d04b9cf7"/>
+    <w:bookmarkStart w:id="13" w:name="Xc814038b117836cfa955e8467093008258a34f0"/>
     <w:p>
       <w:pPr>
         <w:pStyle w:val="Heading3"/>
@@ -3819,7 +3819,7 @@
       </w:r>
     </w:p>
     <w:bookmarkEnd w:id="13"/>
-    <w:bookmarkStart w:id="14" w:name="X9daa35fc18f31bddd6e1f7f4eae9e84c6091343"/>
+    <w:bookmarkStart w:id="14" w:name="Xccc431a65110483b3835808824f8a7e6ea0c158"/>
     <w:p>
       <w:pPr>
         <w:pStyle w:val="Heading3"/>
@@ -4117,7 +4117,7 @@
       </w:r>
     </w:p>
     <w:bookmarkEnd w:id="14"/>
-    <w:bookmarkStart w:id="15" w:name="X9a684f7a530d4c0a026cb8186465e4edfaafdd7"/>
+    <w:bookmarkStart w:id="15" w:name="Xed523ff74934a3b1114691573958b58d6922078"/>
     <w:p>
       <w:pPr>
         <w:pStyle w:val="Heading3"/>
@@ -5731,7 +5731,7 @@
       </w:r>
     </w:p>
     <w:bookmarkEnd w:id="15"/>
-    <w:bookmarkStart w:id="16" w:name="X8e1a19b23da92b078027d1565fbc37e26c47db0"/>
+    <w:bookmarkStart w:id="16" w:name="X166bc83395f84e39a688e8e494ee8f0629fa1ab"/>
     <w:p>
       <w:pPr>
         <w:pStyle w:val="Heading3"/>
@@ -6186,7 +6186,7 @@
     </w:p>
     <w:bookmarkEnd w:id="16"/>
     <w:bookmarkEnd w:id="17"/>
-    <w:bookmarkStart w:id="18" w:name="Xa3cd395538f7ca826572665fa86a18a085d5af3"/>
+    <w:bookmarkStart w:id="18" w:name="X534ed894d3b4de5c35910987ac44b5e7f5a1d10"/>
     <w:p>
       <w:pPr>
         <w:pStyle w:val="Heading2"/>
@@ -6416,7 +6416,7 @@
       </w:r>
     </w:p>
     <w:bookmarkEnd w:id="18"/>
-    <w:bookmarkStart w:id="19" w:name="implementation-notes"/>
+    <w:bookmarkStart w:id="19" w:name="Xcbb7bbbfc35e1654c7c70503cad018c9f88c8f2"/>
     <w:p>
       <w:pPr>
         <w:pStyle w:val="Heading2"/>
@@ -6708,7 +6708,7 @@
       </w:r>
     </w:p>
     <w:bookmarkEnd w:id="19"/>
-    <w:bookmarkStart w:id="20" w:name="use-cases-which-metric-for-which-study"/>
+    <w:bookmarkStart w:id="20" w:name="X827d92fbdbb3d22baf332babb7c2627ad963f1f"/>
     <w:p>
       <w:pPr>
         <w:pStyle w:val="Heading2"/>
@@ -7178,7 +7178,7 @@
       </w:r>
     </w:p>
     <w:bookmarkEnd w:id="20"/>
-    <w:bookmarkStart w:id="21" w:name="using-the-metrics-the-exposure-api"/>
+    <w:bookmarkStart w:id="21" w:name="Xaf0740d6b44172e981c10a8357162cfbfce2fcd"/>
     <w:p>
       <w:pPr>
         <w:pStyle w:val="Heading2"/>
@@ -8474,7 +8474,385 @@
       </w:r>
     </w:p>
     <w:bookmarkEnd w:id="21"/>
+    <w:bookmarkStart w:id="22" w:name="Xb9ef946e6a9678495a5413c3160f40107a20933"/>
+    <w:p>
+      <w:pPr>
+        <w:pStyle w:val="Heading2"/>
+      </w:pPr>
+      <w:r>
+        <w:t xml:space="preserve">8. Worked examples</w:t>
+      </w:r>
+    </w:p>
+    <w:p>
+      <w:pPr>
+        <w:pStyle w:val="FirstParagraph"/>
+      </w:pPr>
+      <w:r>
+        <w:t xml:space="preserve">Runnable, heavily-commented notebooks under</w:t>
+      </w:r>
+      <w:r>
+        <w:t xml:space="preserve"> </w:t>
+      </w:r>
+      <w:r>
+        <w:rPr>
+          <w:rStyle w:val="VerbatimChar"/>
+        </w:rPr>
+        <w:t xml:space="preserve">notebooks/</w:t>
+      </w:r>
+      <w:r>
+        <w:t xml:space="preserve"> </w:t>
+      </w:r>
+      <w:r>
+        <w:t xml:space="preserve">— each is a template for a common study pattern, and</w:t>
+      </w:r>
+      <w:r>
+        <w:t xml:space="preserve"> </w:t>
+      </w:r>
+      <w:r>
+        <w:t xml:space="preserve">the notebooks (not this section) are the living source for the analysis detail.</w:t>
+      </w:r>
+      <w:r>
+        <w:t xml:space="preserve"> </w:t>
+      </w:r>
+      <w:r>
+        <w:rPr>
+          <w:b/>
+          <w:bCs/>
+        </w:rPr>
+        <w:t xml:space="preserve">Run any of these under the</w:t>
+      </w:r>
+      <w:r>
+        <w:rPr>
+          <w:b/>
+          <w:bCs/>
+        </w:rPr>
+        <w:t xml:space="preserve"> </w:t>
+      </w:r>
+      <w:r>
+        <w:rPr>
+          <w:b/>
+          <w:bCs/>
+        </w:rPr>
+        <w:t xml:space="preserve">DESI Master kernel</w:t>
+      </w:r>
+      <w:r>
+        <w:t xml:space="preserve"> </w:t>
+      </w:r>
+      <w:r>
+        <w:t xml:space="preserve">— the direct compute needs</w:t>
+      </w:r>
+      <w:r>
+        <w:t xml:space="preserve"> </w:t>
+      </w:r>
+      <w:r>
+        <w:rPr>
+          <w:rStyle w:val="VerbatimChar"/>
+        </w:rPr>
+        <w:t xml:space="preserve">desimodel</w:t>
+      </w:r>
+      <w:r>
+        <w:t xml:space="preserve">, and its absence fails silently to</w:t>
+      </w:r>
+      <w:r>
+        <w:t xml:space="preserve"> </w:t>
+      </w:r>
+      <w:r>
+        <w:rPr>
+          <w:rStyle w:val="VerbatimChar"/>
+        </w:rPr>
+        <w:t xml:space="preserve">None</w:t>
+      </w:r>
+      <w:r>
+        <w:t xml:space="preserve">.</w:t>
+      </w:r>
+    </w:p>
+    <w:p>
+      <w:pPr>
+        <w:pStyle w:val="Compact"/>
+        <w:numPr>
+          <w:ilvl w:val="0"/>
+          <w:numId w:val="1007"/>
+        </w:numPr>
+      </w:pPr>
+      <w:r>
+        <w:rPr>
+          <w:rStyle w:val="VerbatimChar"/>
+          <w:b/>
+          <w:bCs/>
+        </w:rPr>
+        <w:t xml:space="preserve">mirror_seeing_lsee_example_selectexp.ipynb</w:t>
+      </w:r>
+      <w:r>
+        <w:t xml:space="preserve"> </w:t>
+      </w:r>
+      <w:r>
+        <w:t xml:space="preserve">—</w:t>
+      </w:r>
+      <w:r>
+        <w:t xml:space="preserve"> </w:t>
+      </w:r>
+      <w:r>
+        <w:rPr>
+          <w:rStyle w:val="VerbatimChar"/>
+        </w:rPr>
+        <w:t xml:space="preserve">L_see</w:t>
+      </w:r>
+      <w:r>
+        <w:t xml:space="preserve"> </w:t>
+      </w:r>
+      <w:r>
+        <w:t xml:space="preserve">vs mirror−air ΔT (the mirror-seeing hypothesis).</w:t>
+      </w:r>
+      <w:r>
+        <w:t xml:space="preserve"> </w:t>
+      </w:r>
+      <w:r>
+        <w:t xml:space="preserve">Demonstrates</w:t>
+      </w:r>
+      <w:r>
+        <w:t xml:space="preserve"> </w:t>
+      </w:r>
+      <w:r>
+        <w:rPr>
+          <w:rStyle w:val="VerbatimChar"/>
+        </w:rPr>
+        <w:t xml:space="preserve">exp.L_see</w:t>
+      </w:r>
+      <w:r>
+        <w:t xml:space="preserve"> </w:t>
+      </w:r>
+      <w:r>
+        <w:t xml:space="preserve">pulled in bulk with</w:t>
+      </w:r>
+      <w:r>
+        <w:t xml:space="preserve"> </w:t>
+      </w:r>
+      <w:r>
+        <w:rPr>
+          <w:rStyle w:val="VerbatimChar"/>
+        </w:rPr>
+        <w:t xml:space="preserve">select_exposures</w:t>
+      </w:r>
+      <w:r>
+        <w:t xml:space="preserve"> </w:t>
+      </w:r>
+      <w:r>
+        <w:t xml:space="preserve">(</w:t>
+      </w:r>
+      <w:r>
+        <w:rPr>
+          <w:rStyle w:val="VerbatimChar"/>
+        </w:rPr>
+        <w:t xml:space="preserve">db_row</w:t>
+      </w:r>
+      <w:r>
+        <w:t xml:space="preserve"> </w:t>
+      </w:r>
+      <w:r>
+        <w:t xml:space="preserve">specs for the free DB columns, a</w:t>
+      </w:r>
+      <w:r>
+        <w:t xml:space="preserve"> </w:t>
+      </w:r>
+      <w:r>
+        <w:t xml:space="preserve">callable for the metric), and the asymmetric warm-mirror rise.</w:t>
+      </w:r>
+    </w:p>
+    <w:p>
+      <w:pPr>
+        <w:pStyle w:val="Compact"/>
+        <w:numPr>
+          <w:ilvl w:val="0"/>
+          <w:numId w:val="1007"/>
+        </w:numPr>
+      </w:pPr>
+      <w:r>
+        <w:rPr>
+          <w:rStyle w:val="VerbatimChar"/>
+          <w:b/>
+          <w:bCs/>
+        </w:rPr>
+        <w:t xml:space="preserve">lfield_dam_example_selectexp.ipynb</w:t>
+      </w:r>
+      <w:r>
+        <w:t xml:space="preserve"> </w:t>
+      </w:r>
+      <w:r>
+        <w:t xml:space="preserve">—</w:t>
+      </w:r>
+      <w:r>
+        <w:t xml:space="preserve"> </w:t>
+      </w:r>
+      <w:r>
+        <w:rPr>
+          <w:rStyle w:val="VerbatimChar"/>
+        </w:rPr>
+        <w:t xml:space="preserve">L_field</w:t>
+      </w:r>
+      <w:r>
+        <w:t xml:space="preserve"> </w:t>
+      </w:r>
+      <w:r>
+        <w:t xml:space="preserve">vs intra-exposure</w:t>
+      </w:r>
+      <w:r>
+        <w:t xml:space="preserve"> </w:t>
+      </w:r>
+      <w:r>
+        <w:rPr>
+          <w:rStyle w:val="VerbatimChar"/>
+        </w:rPr>
+        <w:t xml:space="preserve">|Δairmass|</w:t>
+      </w:r>
+      <w:r>
+        <w:t xml:space="preserve"> </w:t>
+      </w:r>
+      <w:r>
+        <w:t xml:space="preserve">(a DAR scheduling lever).</w:t>
+      </w:r>
+      <w:r>
+        <w:t xml:space="preserve"> </w:t>
+      </w:r>
+      <w:r>
+        <w:t xml:space="preserve">Demonstrates</w:t>
+      </w:r>
+      <w:r>
+        <w:t xml:space="preserve"> </w:t>
+      </w:r>
+      <w:r>
+        <w:rPr>
+          <w:rStyle w:val="VerbatimChar"/>
+        </w:rPr>
+        <w:t xml:space="preserve">exp.L_field</w:t>
+      </w:r>
+      <w:r>
+        <w:t xml:space="preserve"> </w:t>
+      </w:r>
+      <w:r>
+        <w:t xml:space="preserve">via</w:t>
+      </w:r>
+      <w:r>
+        <w:t xml:space="preserve"> </w:t>
+      </w:r>
+      <w:r>
+        <w:rPr>
+          <w:rStyle w:val="VerbatimChar"/>
+        </w:rPr>
+        <w:t xml:space="preserve">select_exposures</w:t>
+      </w:r>
+      <w:r>
+        <w:t xml:space="preserve"> </w:t>
+      </w:r>
+      <w:r>
+        <w:t xml:space="preserve">with</w:t>
+      </w:r>
+      <w:r>
+        <w:t xml:space="preserve"> </w:t>
+      </w:r>
+      <w:r>
+        <w:rPr>
+          <w:rStyle w:val="VerbatimChar"/>
+        </w:rPr>
+        <w:t xml:space="preserve">max_workers</w:t>
+      </w:r>
+      <w:r>
+        <w:t xml:space="preserve"> </w:t>
+      </w:r>
+      <w:r>
+        <w:t xml:space="preserve">(justified here —</w:t>
+      </w:r>
+      <w:r>
+        <w:t xml:space="preserve"> </w:t>
+      </w:r>
+      <w:r>
+        <w:rPr>
+          <w:rStyle w:val="VerbatimChar"/>
+        </w:rPr>
+        <w:t xml:space="preserve">L_field</w:t>
+      </w:r>
+      <w:r>
+        <w:t xml:space="preserve"> </w:t>
+      </w:r>
+      <w:r>
+        <w:t xml:space="preserve">does a real</w:t>
+      </w:r>
+      <w:r>
+        <w:t xml:space="preserve"> </w:t>
+      </w:r>
+      <w:r>
+        <w:t xml:space="preserve">per-exposure ETC read) and a self-regenerating disk cache (rebuilt live when missing or built for a different</w:t>
+      </w:r>
+      <w:r>
+        <w:t xml:space="preserve"> </w:t>
+      </w:r>
+      <w:r>
+        <w:t xml:space="preserve">sample), plus an airmass-controlled analysis and the derotated per-fiber quadrupole map behind the scalar.</w:t>
+      </w:r>
+    </w:p>
+    <w:p>
+      <w:pPr>
+        <w:pStyle w:val="Compact"/>
+        <w:numPr>
+          <w:ilvl w:val="0"/>
+          <w:numId w:val="1007"/>
+        </w:numPr>
+      </w:pPr>
+      <w:r>
+        <w:rPr>
+          <w:rStyle w:val="VerbatimChar"/>
+          <w:b/>
+          <w:bCs/>
+        </w:rPr>
+        <w:t xml:space="preserve">rcalibfrac_vs_lfield_example.ipynb</w:t>
+      </w:r>
+      <w:r>
+        <w:t xml:space="preserve"> </w:t>
+      </w:r>
+      <w:r>
+        <w:t xml:space="preserve">— why</w:t>
+      </w:r>
+      <w:r>
+        <w:t xml:space="preserve"> </w:t>
+      </w:r>
+      <w:r>
+        <w:rPr>
+          <w:rStyle w:val="VerbatimChar"/>
+        </w:rPr>
+        <w:t xml:space="preserve">RCALIBFRAC</w:t>
+      </w:r>
+      <w:r>
+        <w:t xml:space="preserve"> </w:t>
+      </w:r>
+      <w:r>
+        <w:t xml:space="preserve">isn’t a clean metric: its per-fiber field is</w:t>
+      </w:r>
+      <w:r>
+        <w:t xml:space="preserve"> </w:t>
+      </w:r>
+      <w:r>
+        <w:t xml:space="preserve">dominated by the rotating dipole artifact (D_rot/Q_rot ≈ 1.9) versus</w:t>
+      </w:r>
+      <w:r>
+        <w:t xml:space="preserve"> </w:t>
+      </w:r>
+      <w:r>
+        <w:rPr>
+          <w:rStyle w:val="VerbatimChar"/>
+        </w:rPr>
+        <w:t xml:space="preserve">L_field</w:t>
+      </w:r>
+      <w:r>
+        <w:t xml:space="preserve">’s pure quadrupole</w:t>
+      </w:r>
+      <w:r>
+        <w:t xml:space="preserve"> </w:t>
+      </w:r>
+      <w:r>
+        <w:t xml:space="preserve">(D_rot = 0). A side-by-side, team-presentation comparison (runs locally on precomputed fields).</w:t>
+      </w:r>
+    </w:p>
     <w:bookmarkEnd w:id="22"/>
+    <w:bookmarkEnd w:id="23"/>
     <w:sectPr>
       <w:footnotePr>
         <w:numRestart w:val="eachSect"/>
@@ -8707,6 +9085,9 @@
     <w:abstractNumId w:val="991"/>
   </w:num>
   <w:num w:numId="1006">
+    <w:abstractNumId w:val="991"/>
+  </w:num>
+  <w:num w:numId="1007">
     <w:abstractNumId w:val="991"/>
   </w:num>
 </w:numbering>

</xml_diff>